<commit_message>
Day 1 (CIBN-derived) assets rebranded for MIPF: template workbook, LBS logo and contact block on the Word files
Co-Authored-By: Claude Sonnet 5.5 <noreply@anthropic.com>
</commit_message>
<xml_diff>
--- a/website/materials/MIPF_Day1_Participant_Workbook.docx
+++ b/website/materials/MIPF_Day1_Participant_Workbook.docx
@@ -7571,6 +7571,18 @@
       <w:t>MIPF Boot Camp, Day 1  |  Infrastructure Finance  |  14 October 2026  |  Prof. Bongo Adi, Lagos Business School</w:t>
     </w:r>
   </w:p>
+  <w:p>
+    <w:pPr>
+      <w:jc w:val="center"/>
+    </w:pPr>
+    <w:r>
+      <w:rPr>
+        <w:color w:val="1C7293"/>
+        <w:sz w:val="16"/>
+      </w:rPr>
+      <w:t>Prof Bongo Adi  |  +234 706 164 8699  |  badi@lbs.edu.ng  |  bongo.adi@fulbrightmail.org</w:t>
+    </w:r>
+  </w:p>
 </w:ftr>
 </file>
 
@@ -7581,6 +7593,40 @@
       <w:pStyle w:val="Header"/>
       <w:jc w:val="right"/>
     </w:pPr>
+    <w:r>
+      <w:drawing>
+        <wp:inline xmlns:a="http://schemas.openxmlformats.org/drawingml/2006/main" xmlns:pic="http://schemas.openxmlformats.org/drawingml/2006/picture">
+          <wp:extent cx="1042968" cy="360000"/>
+          <wp:docPr id="3" name="Picture 3"/>
+          <wp:cNvGraphicFramePr>
+            <a:graphicFrameLocks noChangeAspect="1"/>
+          </wp:cNvGraphicFramePr>
+          <a:graphic>
+            <a:graphicData uri="http://schemas.openxmlformats.org/drawingml/2006/picture">
+              <pic:pic>
+                <pic:nvPicPr>
+                  <pic:cNvPr id="0" name="lbs-logo.png"/>
+                  <pic:cNvPicPr/>
+                </pic:nvPicPr>
+                <pic:blipFill>
+                  <a:blip r:embed="rId3"/>
+                  <a:stretch>
+                    <a:fillRect/>
+                  </a:stretch>
+                </pic:blipFill>
+                <pic:spPr>
+                  <a:xfrm>
+                    <a:off x="0" y="0"/>
+                    <a:ext cx="1042968" cy="360000"/>
+                  </a:xfrm>
+                  <a:prstGeom prst="rect"/>
+                </pic:spPr>
+              </pic:pic>
+            </a:graphicData>
+          </a:graphic>
+        </wp:inline>
+      </w:drawing>
+    </w:r>
     <w:r>
       <w:drawing>
         <wp:inline xmlns:a="http://schemas.openxmlformats.org/drawingml/2006/main" xmlns:pic="http://schemas.openxmlformats.org/drawingml/2006/picture">
@@ -7651,6 +7697,9 @@
           </a:graphic>
         </wp:inline>
       </w:drawing>
+    </w:r>
+    <w:r>
+      <w:t xml:space="preserve">  </w:t>
     </w:r>
   </w:p>
 </w:hdr>

</xml_diff>